<commit_message>
Update mane version 1.0 build 2025.12.11.
</commit_message>
<xml_diff>
--- a/2_design/generative-ai/AVA.docx
+++ b/2_design/generative-ai/AVA.docx
@@ -60,8 +60,19 @@
           <w:sz w:val="32"/>
           <w:szCs w:val="32"/>
         </w:rPr>
-        <w:t xml:space="preserve"> to extend and improve generative model </w:t>
-      </w:r>
+        <w:t xml:space="preserve"> to exte</w:t>
+      </w:r>
+      <w:r>
+        <w:rPr>
+          <w:rStyle w:val="fontstyle01"/>
+          <w:rFonts w:ascii="Times New Roman" w:hAnsi="Times New Roman" w:cs="Times New Roman"/>
+          <w:sz w:val="32"/>
+          <w:szCs w:val="32"/>
+        </w:rPr>
+        <w:t>nd and improve generative model</w:t>
+      </w:r>
+      <w:bookmarkStart w:id="0" w:name="_GoBack"/>
+      <w:bookmarkEnd w:id="0"/>
     </w:p>
     <w:p/>
     <w:p>
@@ -214,7 +225,13 @@
       </w:r>
       <w:proofErr w:type="spellEnd"/>
       <w:r>
-        <w:t xml:space="preserve">) has been developing with many incredible achievements like </w:t>
+        <w:t xml:space="preserve">) has been developing with many </w:t>
+      </w:r>
+      <w:r>
+        <w:t>incredible</w:t>
+      </w:r>
+      <w:r>
+        <w:t xml:space="preserve"> achievements like </w:t>
       </w:r>
       <w:proofErr w:type="spellStart"/>
       <w:r>
@@ -242,10 +259,19 @@
         <w:t xml:space="preserve"> The built-in inference mechanism of DNN</w:t>
       </w:r>
       <w:r>
-        <w:t>, which simulates and aims to synaptic plasticity of human neuron network, fosters generation ability of DGM</w:t>
-      </w:r>
-      <w:r>
-        <w:t xml:space="preserve"> which produces surprised results with </w:t>
+        <w:t xml:space="preserve">, which simulates and aims </w:t>
+      </w:r>
+      <w:r>
+        <w:t>to</w:t>
+      </w:r>
+      <w:r>
+        <w:t xml:space="preserve"> synaptic plasticity of human neuron network, fosters generation ability of DGM</w:t>
+      </w:r>
+      <w:r>
+        <w:t xml:space="preserve"> which produces surprising</w:t>
+      </w:r>
+      <w:r>
+        <w:t xml:space="preserve"> results with </w:t>
       </w:r>
       <w:r>
         <w:t>support</w:t>
@@ -294,10 +320,16 @@
         <w:t>lthough they</w:t>
       </w:r>
       <w:r>
-        <w:t xml:space="preserve"> share and imply underline theory of statistics as well as </w:t>
-      </w:r>
-      <w:r>
-        <w:t xml:space="preserve">incredible </w:t>
+        <w:t xml:space="preserve"> share and imply underlying</w:t>
+      </w:r>
+      <w:r>
+        <w:t xml:space="preserve"> theory of statistics as well as </w:t>
+      </w:r>
+      <w:r>
+        <w:t>significant</w:t>
+      </w:r>
+      <w:r>
+        <w:t xml:space="preserve"> </w:t>
       </w:r>
       <w:r>
         <w:t>complex via hidden layers of DNN when</w:t>
@@ -358,7 +390,13 @@
         <w:t xml:space="preserve">VAE and GAN </w:t>
       </w:r>
       <w:r>
-        <w:t xml:space="preserve">complement each other, for instance, VAE is </w:t>
+        <w:t>complement each other</w:t>
+      </w:r>
+      <w:r>
+        <w:t>,</w:t>
+      </w:r>
+      <w:r>
+        <w:t xml:space="preserve"> for instance, VAE is </w:t>
       </w:r>
       <w:r>
         <w:t xml:space="preserve">a </w:t>
@@ -396,7 +434,19 @@
         <w:t xml:space="preserve"> important method to assess reliability of data</w:t>
       </w:r>
       <w:r>
-        <w:t xml:space="preserve"> which is realistic or fake</w:t>
+        <w:t xml:space="preserve"> </w:t>
+      </w:r>
+      <w:r>
+        <w:t xml:space="preserve">as to whether </w:t>
+      </w:r>
+      <w:r>
+        <w:t>the data</w:t>
+      </w:r>
+      <w:r>
+        <w:t xml:space="preserve"> is</w:t>
+      </w:r>
+      <w:r>
+        <w:t xml:space="preserve"> realistic or fake</w:t>
       </w:r>
       <w:r>
         <w:t>.</w:t>
@@ -432,7 +482,13 @@
         <w:t xml:space="preserve">. </w:t>
       </w:r>
       <w:r>
-        <w:t>In methodology t</w:t>
+        <w:t>In methodology</w:t>
+      </w:r>
+      <w:r>
+        <w:t>,</w:t>
+      </w:r>
+      <w:r>
+        <w:t xml:space="preserve"> t</w:t>
       </w:r>
       <w:r>
         <w:t>his research focuse</w:t>
@@ -1348,13 +1404,14 @@
         <w:t>weighted</w:t>
       </w:r>
       <w:r>
-        <w:t xml:space="preserve"> with regular </w:t>
-      </w:r>
-      <w:proofErr w:type="spellStart"/>
-      <w:r>
-        <w:t>hyperparameters</w:t>
-      </w:r>
-      <w:proofErr w:type="spellEnd"/>
+        <w:t xml:space="preserve"> with regular hyper</w:t>
+      </w:r>
+      <w:r>
+        <w:t>-</w:t>
+      </w:r>
+      <w:r>
+        <w:t>parameters</w:t>
+      </w:r>
       <w:r>
         <w:t xml:space="preserve"> </w:t>
       </w:r>
@@ -21843,7 +21900,13 @@
         <w:t>.</w:t>
       </w:r>
       <w:r>
-        <w:t xml:space="preserve"> The generative AI application supporting AVA is available at https://github.com/ngphloc/ai/tree/main/3_implementation which requires Java 15.</w:t>
+        <w:t xml:space="preserve"> The generative AI application supporting AVA is available at </w:t>
+      </w:r>
+      <w:r>
+        <w:t>https://github.com/ngphloc/ai/tree/main/3_implementation/src/net/ea/ann/gen</w:t>
+      </w:r>
+      <w:r>
+        <w:t xml:space="preserve"> which requires Java 15.</w:t>
       </w:r>
     </w:p>
     <w:p/>
@@ -30391,7 +30454,13 @@
         <w:t xml:space="preserve">. </w:t>
       </w:r>
       <w:r>
-        <w:t>For example, the two following images depict two positions of a dragon and a tiger</w:t>
+        <w:t xml:space="preserve">For example, the two following images </w:t>
+      </w:r>
+      <w:r>
+        <w:t xml:space="preserve">(figure 5) </w:t>
+      </w:r>
+      <w:r>
+        <w:t>depict two positions of a dragon and a tiger</w:t>
       </w:r>
       <w:r>
         <w:t xml:space="preserve"> among 36 positions</w:t>
@@ -30400,10 +30469,25 @@
         <w:t>.</w:t>
       </w:r>
       <w:r>
-        <w:t xml:space="preserve"> For each tested image, DGMs are not retrained for fair testing</w:t>
-      </w:r>
-      <w:r>
-        <w:t xml:space="preserve"> because there is no splitting of training set and testing set</w:t>
+        <w:t xml:space="preserve"> For each tested image, </w:t>
+      </w:r>
+      <w:r>
+        <w:t xml:space="preserve">due to </w:t>
+      </w:r>
+      <w:r>
+        <w:t>fair testing</w:t>
+      </w:r>
+      <w:r>
+        <w:t>,</w:t>
+      </w:r>
+      <w:r>
+        <w:t xml:space="preserve"> </w:t>
+      </w:r>
+      <w:r>
+        <w:t xml:space="preserve">DGMs are not retrained </w:t>
+      </w:r>
+      <w:r>
+        <w:t>because there is no splitting of training set and testing set</w:t>
       </w:r>
       <w:r>
         <w:t>.</w:t>
@@ -30547,6 +30631,20 @@
         </w:tc>
       </w:tr>
     </w:tbl>
+    <w:p>
+      <w:pPr>
+        <w:jc w:val="center"/>
+      </w:pPr>
+      <w:r>
+        <w:rPr>
+          <w:b/>
+        </w:rPr>
+        <w:t>Figure 5.</w:t>
+      </w:r>
+      <w:r>
+        <w:t xml:space="preserve"> Images for DGM training and testing</w:t>
+      </w:r>
+    </w:p>
     <w:p>
       <w:r>
         <w:t xml:space="preserve">It is necessary to define how good </w:t>
@@ -36002,7 +36100,10 @@
         <w:t xml:space="preserve">igure </w:t>
       </w:r>
       <w:r>
-        <w:t xml:space="preserve">5 </w:t>
+        <w:t>6</w:t>
+      </w:r>
+      <w:r>
+        <w:t xml:space="preserve"> </w:t>
       </w:r>
       <w:r>
         <w:t>depicts BM means, BM maxima, BM minima, and BM standard deviations of AVAs, VAE, and GAN by charts.</w:t>
@@ -36069,7 +36170,21 @@
           <w:b/>
           <w:bCs/>
         </w:rPr>
-        <w:t>Figure 5.</w:t>
+        <w:t xml:space="preserve">Figure </w:t>
+      </w:r>
+      <w:r>
+        <w:rPr>
+          <w:b/>
+          <w:bCs/>
+        </w:rPr>
+        <w:t>6</w:t>
+      </w:r>
+      <w:r>
+        <w:rPr>
+          <w:b/>
+          <w:bCs/>
+        </w:rPr>
+        <w:t>.</w:t>
       </w:r>
       <w:r>
         <w:t xml:space="preserve"> </w:t>
@@ -36312,8 +36427,6 @@
       <w:r>
         <w:t>.</w:t>
       </w:r>
-      <w:bookmarkStart w:id="0" w:name="_GoBack"/>
-      <w:bookmarkEnd w:id="0"/>
     </w:p>
     <w:p/>
     <w:p>
@@ -38091,7 +38204,7 @@
 </file>
 
 <file path=customXml/itemProps1.xml><?xml version="1.0" encoding="utf-8"?>
-<ds:datastoreItem xmlns:ds="http://schemas.openxmlformats.org/officeDocument/2006/customXml" ds:itemID="{CAE25553-7620-4A77-961A-F06649B36C1E}">
+<ds:datastoreItem xmlns:ds="http://schemas.openxmlformats.org/officeDocument/2006/customXml" ds:itemID="{E09B0547-B692-4F10-8E4A-7098E0437334}">
   <ds:schemaRefs>
     <ds:schemaRef ds:uri="http://schemas.openxmlformats.org/officeDocument/2006/bibliography"/>
   </ds:schemaRefs>

</xml_diff>